<commit_message>
Documentacion modelo conceptual MODULO 3 (Disponibilidades)
</commit_message>
<xml_diff>
--- a/Docs/Proyecto 1 Documentación (2).docx
+++ b/Docs/Proyecto 1 Documentación (2).docx
@@ -25,12 +25,12 @@
             <wp:extent cx="3633788" cy="1909028"/>
             <wp:effectExtent b="0" l="0" r="0" t="0"/>
             <wp:wrapSquare wrapText="bothSides" distB="114300" distT="114300" distL="114300" distR="114300"/>
-            <wp:docPr id="2" name="image1.png"/>
+            <wp:docPr id="3" name="image2.png"/>
             <a:graphic>
               <a:graphicData uri="http://schemas.openxmlformats.org/drawingml/2006/picture">
                 <pic:pic>
                   <pic:nvPicPr>
-                    <pic:cNvPr id="0" name="image1.png"/>
+                    <pic:cNvPr id="0" name="image2.png"/>
                     <pic:cNvPicPr preferRelativeResize="0"/>
                   </pic:nvPicPr>
                   <pic:blipFill>
@@ -777,12 +777,12 @@
             <wp:extent cx="6586538" cy="4577949"/>
             <wp:effectExtent b="0" l="0" r="0" t="0"/>
             <wp:wrapSquare wrapText="bothSides" distB="114300" distT="114300" distL="114300" distR="114300"/>
-            <wp:docPr id="3" name="image2.png"/>
+            <wp:docPr id="6" name="image3.png"/>
             <a:graphic>
               <a:graphicData uri="http://schemas.openxmlformats.org/drawingml/2006/picture">
                 <pic:pic>
                   <pic:nvPicPr>
-                    <pic:cNvPr id="0" name="image2.png"/>
+                    <pic:cNvPr id="0" name="image3.png"/>
                     <pic:cNvPicPr preferRelativeResize="0"/>
                   </pic:nvPicPr>
                   <pic:blipFill>
@@ -3235,12 +3235,12 @@
           <wp:inline distB="114300" distT="114300" distL="114300" distR="114300">
             <wp:extent cx="5731200" cy="5283200"/>
             <wp:effectExtent b="0" l="0" r="0" t="0"/>
-            <wp:docPr id="5" name="image5.png"/>
+            <wp:docPr id="8" name="image6.png"/>
             <a:graphic>
               <a:graphicData uri="http://schemas.openxmlformats.org/drawingml/2006/picture">
                 <pic:pic>
                   <pic:nvPicPr>
-                    <pic:cNvPr id="0" name="image5.png"/>
+                    <pic:cNvPr id="0" name="image6.png"/>
                     <pic:cNvPicPr preferRelativeResize="0"/>
                   </pic:nvPicPr>
                   <pic:blipFill>
@@ -3301,12 +3301,12 @@
           <wp:inline distB="114300" distT="114300" distL="114300" distR="114300">
             <wp:extent cx="5731200" cy="5562600"/>
             <wp:effectExtent b="0" l="0" r="0" t="0"/>
-            <wp:docPr id="1" name="image3.png"/>
+            <wp:docPr id="2" name="image4.png"/>
             <a:graphic>
               <a:graphicData uri="http://schemas.openxmlformats.org/drawingml/2006/picture">
                 <pic:pic>
                   <pic:nvPicPr>
-                    <pic:cNvPr id="0" name="image3.png"/>
+                    <pic:cNvPr id="0" name="image4.png"/>
                     <pic:cNvPicPr preferRelativeResize="0"/>
                   </pic:nvPicPr>
                   <pic:blipFill>
@@ -3370,6 +3370,145 @@
           <w:bCs w:val="1"/>
           <w:rtl w:val="0"/>
         </w:rPr>
+        <w:t xml:space="preserve">Módulo de Disponibilidad de Usuarios y Gestión de Tiempos (RF-11 y RF-12)</w:t>
+      </w:r>
+    </w:p>
+    <w:p>
+      <w:pPr>
+        <w:spacing w:after="240" w:before="240" w:lineRule="auto"/>
+        <w:ind w:left="0" w:firstLine="0"/>
+        <w:rPr/>
+      </w:pPr>
+      <w:r>
+        <w:rPr>
+          <w:rtl w:val="0"/>
+        </w:rPr>
+        <w:t xml:space="preserve">Modelo conceptual</w:t>
+      </w:r>
+    </w:p>
+    <w:p>
+      <w:pPr>
+        <w:spacing w:after="240" w:before="240" w:lineRule="auto"/>
+        <w:ind w:left="0" w:firstLine="0"/>
+        <w:rPr/>
+      </w:pPr>
+      <w:r>
+        <w:rPr>
+          <w:rtl w:val="0"/>
+        </w:rPr>
+        <w:t xml:space="preserve">Se creó la entidad DISPONIBILIDADES y la entidad CATALOGO_TIPO_DISPONIBILIDAD. Estas dos entidades se relacionan entre sí con una relación 1:N porque un tipo de disponibilidad (ocupado) se puede relacionar con muchas disponibilidades (martes 8:00 AM a 10:00 AM, miércoles 9:00 AM a 10:00 AM, entre otros) y una disponibilidad se relaciona únicamente con un tipo de disponibilidad. </w:t>
+      </w:r>
+    </w:p>
+    <w:p>
+      <w:pPr>
+        <w:spacing w:after="240" w:before="240" w:lineRule="auto"/>
+        <w:ind w:left="0" w:firstLine="0"/>
+        <w:rPr/>
+      </w:pPr>
+      <w:r>
+        <w:rPr>
+          <w:rtl w:val="0"/>
+        </w:rPr>
+        <w:t xml:space="preserve">Y se relaciono DISPONIBILIDAD con USUARIOS mediante una relación 1:N porque una disponibilidad (martes en la mañana) es única de cada usuario y un usuario tiene muchas disponibilidades (miércoles en la tarde, viernes en la noche).</w:t>
+      </w:r>
+      <w:r>
+        <w:drawing>
+          <wp:anchor allowOverlap="1" behindDoc="0" distB="114300" distT="114300" distL="114300" distR="114300" hidden="0" layoutInCell="1" locked="0" relativeHeight="0" simplePos="0">
+            <wp:simplePos x="0" y="0"/>
+            <wp:positionH relativeFrom="column">
+              <wp:posOffset>-758661</wp:posOffset>
+            </wp:positionH>
+            <wp:positionV relativeFrom="paragraph">
+              <wp:posOffset>714375</wp:posOffset>
+            </wp:positionV>
+            <wp:extent cx="7248427" cy="4255150"/>
+            <wp:effectExtent b="0" l="0" r="0" t="0"/>
+            <wp:wrapSquare wrapText="bothSides" distB="114300" distT="114300" distL="114300" distR="114300"/>
+            <wp:docPr id="5" name="image8.png"/>
+            <a:graphic>
+              <a:graphicData uri="http://schemas.openxmlformats.org/drawingml/2006/picture">
+                <pic:pic>
+                  <pic:nvPicPr>
+                    <pic:cNvPr id="0" name="image8.png"/>
+                    <pic:cNvPicPr preferRelativeResize="0"/>
+                  </pic:nvPicPr>
+                  <pic:blipFill>
+                    <a:blip r:embed="rId10"/>
+                    <a:srcRect b="0" l="0" r="0" t="0"/>
+                    <a:stretch>
+                      <a:fillRect/>
+                    </a:stretch>
+                  </pic:blipFill>
+                  <pic:spPr>
+                    <a:xfrm>
+                      <a:off x="0" y="0"/>
+                      <a:ext cx="7248427" cy="4255150"/>
+                    </a:xfrm>
+                    <a:prstGeom prst="rect"/>
+                    <a:ln/>
+                  </pic:spPr>
+                </pic:pic>
+              </a:graphicData>
+            </a:graphic>
+          </wp:anchor>
+        </w:drawing>
+      </w:r>
+    </w:p>
+    <w:p>
+      <w:pPr>
+        <w:spacing w:after="240" w:before="240" w:lineRule="auto"/>
+        <w:ind w:left="0" w:firstLine="0"/>
+        <w:rPr/>
+      </w:pPr>
+      <w:r>
+        <w:rPr>
+          <w:rtl w:val="0"/>
+        </w:rPr>
+      </w:r>
+    </w:p>
+    <w:p>
+      <w:pPr>
+        <w:spacing w:after="240" w:before="240" w:lineRule="auto"/>
+        <w:ind w:left="0" w:firstLine="0"/>
+        <w:rPr/>
+      </w:pPr>
+      <w:r>
+        <w:rPr>
+          <w:rtl w:val="0"/>
+        </w:rPr>
+        <w:t xml:space="preserve">Modelo Lógico</w:t>
+      </w:r>
+    </w:p>
+    <w:p>
+      <w:pPr>
+        <w:spacing w:after="240" w:before="240" w:lineRule="auto"/>
+        <w:ind w:left="0" w:firstLine="0"/>
+        <w:rPr/>
+      </w:pPr>
+      <w:r>
+        <w:br w:type="page"/>
+      </w:r>
+      <w:r>
+        <w:rPr>
+          <w:rtl w:val="0"/>
+        </w:rPr>
+      </w:r>
+    </w:p>
+    <w:p>
+      <w:pPr>
+        <w:spacing w:after="240" w:before="240" w:lineRule="auto"/>
+        <w:ind w:left="0" w:firstLine="0"/>
+        <w:rPr>
+          <w:b w:val="1"/>
+          <w:bCs w:val="1"/>
+        </w:rPr>
+      </w:pPr>
+      <w:r>
+        <w:rPr>
+          <w:b w:val="1"/>
+          <w:bCs w:val="1"/>
+          <w:rtl w:val="0"/>
+        </w:rPr>
         <w:t xml:space="preserve">Módulo de Tareas Asociadas a Eventos (RF-15 a RF-17)</w:t>
       </w:r>
     </w:p>
@@ -3417,16 +3556,16 @@
             <wp:extent cx="6921221" cy="4426362"/>
             <wp:effectExtent b="0" l="0" r="0" t="0"/>
             <wp:wrapSquare wrapText="bothSides" distB="114300" distT="114300" distL="114300" distR="114300"/>
-            <wp:docPr id="4" name="image4.png"/>
+            <wp:docPr id="7" name="image7.png"/>
             <a:graphic>
               <a:graphicData uri="http://schemas.openxmlformats.org/drawingml/2006/picture">
                 <pic:pic>
                   <pic:nvPicPr>
-                    <pic:cNvPr id="0" name="image4.png"/>
+                    <pic:cNvPr id="0" name="image7.png"/>
                     <pic:cNvPicPr preferRelativeResize="0"/>
                   </pic:nvPicPr>
                   <pic:blipFill>
-                    <a:blip r:embed="rId10"/>
+                    <a:blip r:embed="rId11"/>
                     <a:srcRect b="0" l="0" r="0" t="0"/>
                     <a:stretch>
                       <a:fillRect/>
@@ -4716,7 +4855,7 @@
               <w:rPr>
                 <w:rtl w:val="0"/>
               </w:rPr>
-              <w:t xml:space="preserve">Se juntaron las tablas USUARIOS y TAREAS mediante un JOIN con el dato que las conecta, es decir, id_usuario en usuarios y id_usuario_responsable en tareas. Una vez juntas se agarró con un SELECT COUNT() la cantidad de datos de ‘estado’ donde es exactamente igual que ‘Pendiente’ y ‘En progreso’ con un WHERE, los nombres de los usuarios y el estado exacto de las tareas, finalmente se agruparon con un GROUP BY por el estado de la tarea y nombre de usuario para obtener cuantas tareas Pendiente y cuantas En progreso tiene cada uno y se ordenó con un ORDER BY con la cuenta del inicio del SELECT COUNT() de mayor a menor.</w:t>
+              <w:t xml:space="preserve">Se juntaron las tablas USUARIOS y TAREAS mediante un JOIN con el dato que las conecta, es decir, id_usuario en usuarios y id_usuario_responsable en tareas. Una vez juntas se agarró con un SELECT COUNT() la cantidad de datos de ‘estado’ donde es exactamente igual que ‘Pendiente’ y ‘En progreso’ con un WHERE, los nombres de los usuarios y el estado exacto de las tareas, finalmente se agruparon con un GROUP BY por el estado de la tarea, nombre de usuario y el id del usuario para obtener cuantas tareas ‘Pendiente’ y cuantas ‘En progreso’ tiene cada uno y no pase nada si hay 2 usuarios que se llaman igual y se ordenó con un ORDER BY con la cuenta del inicio del SELECT COUNT() de mayor a menor.</w:t>
             </w:r>
           </w:p>
         </w:tc>
@@ -4773,12 +4912,190 @@
               <w:rPr>
                 <w:rtl w:val="0"/>
               </w:rPr>
-              <w:t xml:space="preserve">Se juntaron las tablas TAREAS, EVENTOS y USUARIOS mediante dos JOIN. El primero conecta TAREAS con EVENTOS usando id_evento en ambas tablas, y el segundo conecta TAREAS con USUARIOS usando id_usuario_responsable en tareas e id_usuario en usuarios. Una vez juntas las tres tablas, se agarró con un SELECT el título de la tarea (renombrado como titulo_tareas), el título del evento (renombrado como titulo_evento, ambas renombraciones porque a ambas llamarse titulo, da error al haber dos columnas llamadas igual), el nombre del usuario responsable, la fecha límite de la tarea y su estado actual. Finalmente, se filtró con un WHERE para que solo aparezcan las tareas cuya fecha_limite ya pasó respecto al momento actual, esto con un fecha_limite &lt; NOW(), y que además su estado no sea 'Completado' ni 'Cancelada', para asi solo salgan las Vencidas</w:t>
+              <w:t xml:space="preserve">Se juntaron las tablas TAREAS, EVENTOS y USUARIOS mediante dos JOIN. El primero conecta TAREAS con EVENTOS usando id_evento en ambas tablas, y el segundo conecta TAREAS con USUARIOS usando id_usuario_responsable en tareas e id_usuario en usuarios. Una vez juntas las tres tablas, se agarró con un SELECT el título de la tarea (renombrado como titulo_tareas), el título del evento (renombrado como titulo_evento, ambas renombraciones porque a ambas llamarse título, da error al haber dos columnas llamadas igual), el nombre del usuario responsable, la fecha límite de la tarea y su estado actual. Finalmente, se filtró con un WHERE para que solo aparezcan las tareas cuya fecha_limite ya pasó respecto al momento actual, esto con un fecha_limite &lt; NOW(), y que además su estado no sea 'Completado' ni 'Cancelada', para asi solo salgan las Vencidas</w:t>
             </w:r>
           </w:p>
         </w:tc>
       </w:tr>
     </w:tbl>
+    <w:p>
+      <w:pPr>
+        <w:rPr/>
+      </w:pPr>
+      <w:r>
+        <w:rPr>
+          <w:rtl w:val="0"/>
+        </w:rPr>
+      </w:r>
+    </w:p>
+    <w:p>
+      <w:pPr>
+        <w:rPr/>
+      </w:pPr>
+      <w:r>
+        <w:br w:type="page"/>
+      </w:r>
+      <w:r>
+        <w:rPr>
+          <w:rtl w:val="0"/>
+        </w:rPr>
+      </w:r>
+    </w:p>
+    <w:p>
+      <w:pPr>
+        <w:rPr/>
+      </w:pPr>
+      <w:r>
+        <w:rPr>
+          <w:rtl w:val="0"/>
+        </w:rPr>
+        <w:t xml:space="preserve">Prueba de la vista de tareas vencidas antes de la interfaz gráfica, con el caso de robusticidad de que haya dos usuarios con el mismo nombre.</w:t>
+      </w:r>
+    </w:p>
+    <w:p>
+      <w:pPr>
+        <w:rPr/>
+      </w:pPr>
+      <w:r>
+        <w:rPr/>
+        <w:drawing>
+          <wp:inline distB="114300" distT="114300" distL="114300" distR="114300">
+            <wp:extent cx="5731200" cy="3987800"/>
+            <wp:effectExtent b="0" l="0" r="0" t="0"/>
+            <wp:docPr id="1" name="image1.png"/>
+            <a:graphic>
+              <a:graphicData uri="http://schemas.openxmlformats.org/drawingml/2006/picture">
+                <pic:pic>
+                  <pic:nvPicPr>
+                    <pic:cNvPr id="0" name="image1.png"/>
+                    <pic:cNvPicPr preferRelativeResize="0"/>
+                  </pic:nvPicPr>
+                  <pic:blipFill>
+                    <a:blip r:embed="rId12"/>
+                    <a:srcRect b="0" l="0" r="0" t="0"/>
+                    <a:stretch>
+                      <a:fillRect/>
+                    </a:stretch>
+                  </pic:blipFill>
+                  <pic:spPr>
+                    <a:xfrm>
+                      <a:off x="0" y="0"/>
+                      <a:ext cx="5731200" cy="3987800"/>
+                    </a:xfrm>
+                    <a:prstGeom prst="rect"/>
+                    <a:ln/>
+                  </pic:spPr>
+                </pic:pic>
+              </a:graphicData>
+            </a:graphic>
+          </wp:inline>
+        </w:drawing>
+      </w:r>
+      <w:r>
+        <w:rPr>
+          <w:rtl w:val="0"/>
+        </w:rPr>
+      </w:r>
+    </w:p>
+    <w:p>
+      <w:pPr>
+        <w:rPr/>
+      </w:pPr>
+      <w:r>
+        <w:rPr>
+          <w:rtl w:val="0"/>
+        </w:rPr>
+      </w:r>
+    </w:p>
+    <w:p>
+      <w:pPr>
+        <w:rPr/>
+      </w:pPr>
+      <w:r>
+        <w:br w:type="page"/>
+      </w:r>
+      <w:r>
+        <w:rPr>
+          <w:rtl w:val="0"/>
+        </w:rPr>
+      </w:r>
+    </w:p>
+    <w:p>
+      <w:pPr>
+        <w:rPr/>
+      </w:pPr>
+      <w:r>
+        <w:rPr>
+          <w:rtl w:val="0"/>
+        </w:rPr>
+        <w:t xml:space="preserve">Prueba de la vista de tareas pendientes antes de la interfaz gráfica, igual con apellidos. Ambos tienen dos tareas pendientes</w:t>
+      </w:r>
+    </w:p>
+    <w:p>
+      <w:pPr>
+        <w:rPr/>
+      </w:pPr>
+      <w:r>
+        <w:rPr>
+          <w:rtl w:val="0"/>
+        </w:rPr>
+      </w:r>
+    </w:p>
+    <w:p>
+      <w:pPr>
+        <w:rPr/>
+      </w:pPr>
+      <w:r>
+        <w:rPr/>
+        <w:drawing>
+          <wp:inline distB="114300" distT="114300" distL="114300" distR="114300">
+            <wp:extent cx="5731200" cy="4508500"/>
+            <wp:effectExtent b="0" l="0" r="0" t="0"/>
+            <wp:docPr id="4" name="image5.png"/>
+            <a:graphic>
+              <a:graphicData uri="http://schemas.openxmlformats.org/drawingml/2006/picture">
+                <pic:pic>
+                  <pic:nvPicPr>
+                    <pic:cNvPr id="0" name="image5.png"/>
+                    <pic:cNvPicPr preferRelativeResize="0"/>
+                  </pic:nvPicPr>
+                  <pic:blipFill>
+                    <a:blip r:embed="rId13"/>
+                    <a:srcRect b="0" l="0" r="0" t="0"/>
+                    <a:stretch>
+                      <a:fillRect/>
+                    </a:stretch>
+                  </pic:blipFill>
+                  <pic:spPr>
+                    <a:xfrm>
+                      <a:off x="0" y="0"/>
+                      <a:ext cx="5731200" cy="4508500"/>
+                    </a:xfrm>
+                    <a:prstGeom prst="rect"/>
+                    <a:ln/>
+                  </pic:spPr>
+                </pic:pic>
+              </a:graphicData>
+            </a:graphic>
+          </wp:inline>
+        </w:drawing>
+      </w:r>
+      <w:r>
+        <w:rPr>
+          <w:rtl w:val="0"/>
+        </w:rPr>
+      </w:r>
+    </w:p>
+    <w:p>
+      <w:pPr>
+        <w:rPr/>
+      </w:pPr>
+      <w:r>
+        <w:rPr>
+          <w:rtl w:val="0"/>
+        </w:rPr>
+      </w:r>
+    </w:p>
     <w:p>
       <w:pPr>
         <w:rPr/>

</xml_diff>